<commit_message>
created get api for categories and questions
</commit_message>
<xml_diff>
--- a/ROOT MAP.docx
+++ b/ROOT MAP.docx
@@ -4,6 +4,67 @@
   <w:body>
     <w:p>
       <w:pPr>
+        <w:pStyle w:val="4"/>
+        <w:keepNext w:val="0"/>
+        <w:keepLines w:val="0"/>
+        <w:widowControl/>
+        <w:suppressLineNumbers w:val="0"/>
+      </w:pPr>
+      <w:r>
+        <w:rPr>
+          <w:rFonts w:hint="default"/>
+          <w:lang w:val="en-US"/>
+        </w:rPr>
+        <w:t>serevr:</w:t>
+      </w:r>
+      <w:r>
+        <w:rPr>
+          <w:rFonts w:hint="default"/>
+          <w:lang w:val="en-US"/>
+        </w:rPr>
+        <w:br w:type="textWrapping"/>
+      </w:r>
+      <w:r>
+        <w:rPr>
+          <w:rFonts w:hint="default"/>
+          <w:lang w:val="en-US"/>
+        </w:rPr>
+        <w:br w:type="textWrapping"/>
+      </w:r>
+      <w:r>
+        <w:rPr>
+          <w:rStyle w:val="5"/>
+        </w:rPr>
+        <w:t>psql -U postgres -h 127.0.0.1</w:t>
+      </w:r>
+    </w:p>
+    <w:p>
+      <w:pPr>
+        <w:rPr>
+          <w:rFonts w:hint="default"/>
+          <w:lang w:val="en-US"/>
+        </w:rPr>
+      </w:pPr>
+      <w:r>
+        <w:rPr>
+          <w:rFonts w:hint="default"/>
+          <w:lang w:val="en-US"/>
+        </w:rPr>
+        <w:t>admin123</w:t>
+      </w:r>
+      <w:bookmarkStart w:id="0" w:name="_GoBack"/>
+      <w:bookmarkEnd w:id="0"/>
+    </w:p>
+    <w:p>
+      <w:pPr>
+        <w:rPr>
+          <w:rFonts w:hint="default"/>
+          <w:lang w:val="en-US"/>
+        </w:rPr>
+      </w:pPr>
+    </w:p>
+    <w:p>
+      <w:pPr>
         <w:rPr>
           <w:rFonts w:hint="default"/>
           <w:lang w:val="en-US"/>
@@ -213,8 +274,6 @@
         </w:rPr>
         <w:t>Inserted values into testcases</w:t>
       </w:r>
-      <w:bookmarkStart w:id="0" w:name="_GoBack"/>
-      <w:bookmarkEnd w:id="0"/>
     </w:p>
     <w:p>
       <w:pPr>
@@ -227,6 +286,73 @@
           <w:lang w:val="en-US"/>
         </w:rPr>
       </w:pPr>
+      <w:r>
+        <w:rPr>
+          <w:rFonts w:hint="default"/>
+          <w:lang w:val="en-US"/>
+        </w:rPr>
+        <w:t>Creating /get endpoints:</w:t>
+      </w:r>
+    </w:p>
+    <w:p>
+      <w:pPr>
+        <w:numPr>
+          <w:ilvl w:val="1"/>
+          <w:numId w:val="1"/>
+        </w:numPr>
+        <w:ind w:left="840" w:leftChars="0" w:hanging="420" w:firstLineChars="0"/>
+        <w:rPr>
+          <w:rFonts w:hint="default"/>
+          <w:lang w:val="en-US"/>
+        </w:rPr>
+      </w:pPr>
+      <w:r>
+        <w:rPr>
+          <w:rFonts w:hint="default"/>
+          <w:lang w:val="en-US"/>
+        </w:rPr>
+        <w:t>GET /api/categories</w:t>
+      </w:r>
+    </w:p>
+    <w:p>
+      <w:pPr>
+        <w:numPr>
+          <w:ilvl w:val="1"/>
+          <w:numId w:val="1"/>
+        </w:numPr>
+        <w:ind w:left="840" w:leftChars="0" w:hanging="420" w:firstLineChars="0"/>
+        <w:rPr>
+          <w:rFonts w:hint="default"/>
+          <w:lang w:val="en-US"/>
+        </w:rPr>
+      </w:pPr>
+      <w:r>
+        <w:rPr>
+          <w:rFonts w:hint="default"/>
+          <w:lang w:val="en-US"/>
+        </w:rPr>
+        <w:t>GET /api/categories/:id/questions</w:t>
+      </w:r>
+    </w:p>
+    <w:p>
+      <w:pPr>
+        <w:numPr>
+          <w:ilvl w:val="1"/>
+          <w:numId w:val="1"/>
+        </w:numPr>
+        <w:ind w:left="840" w:leftChars="0" w:hanging="420" w:firstLineChars="0"/>
+        <w:rPr>
+          <w:rFonts w:hint="default"/>
+          <w:lang w:val="en-US"/>
+        </w:rPr>
+      </w:pPr>
+      <w:r>
+        <w:rPr>
+          <w:rFonts w:hint="default"/>
+          <w:lang w:val="en-US"/>
+        </w:rPr>
+        <w:t>GET /api/categories/:id/testcases</w:t>
+      </w:r>
     </w:p>
     <w:sectPr>
       <w:pgSz w:w="11906" w:h="16838"/>
@@ -242,7 +368,7 @@
 <w:numbering xmlns:wpc="http://schemas.microsoft.com/office/word/2010/wordprocessingCanvas" xmlns:mc="http://schemas.openxmlformats.org/markup-compatibility/2006" xmlns:o="urn:schemas-microsoft-com:office:office" xmlns:r="http://schemas.openxmlformats.org/officeDocument/2006/relationships" xmlns:m="http://schemas.openxmlformats.org/officeDocument/2006/math" xmlns:v="urn:schemas-microsoft-com:vml" xmlns:wp14="http://schemas.microsoft.com/office/word/2010/wordprocessingDrawing" xmlns:wp="http://schemas.openxmlformats.org/drawingml/2006/wordprocessingDrawing" xmlns:w10="urn:schemas-microsoft-com:office:word" xmlns:w="http://schemas.openxmlformats.org/wordprocessingml/2006/main" xmlns:w14="http://schemas.microsoft.com/office/word/2010/wordml" xmlns:wpg="http://schemas.microsoft.com/office/word/2010/wordprocessingGroup" xmlns:wpi="http://schemas.microsoft.com/office/word/2010/wordprocessingInk" xmlns:wne="http://schemas.microsoft.com/office/word/2006/wordml" xmlns:wps="http://schemas.microsoft.com/office/word/2010/wordprocessingShape" xmlns:wpsCustomData="http://www.wps.cn/officeDocument/2013/wpsCustomData" mc:Ignorable="w14 wp14">
   <w:abstractNum w:abstractNumId="0">
     <w:nsid w:val="FE3E87A1"/>
-    <w:multiLevelType w:val="singleLevel"/>
+    <w:multiLevelType w:val="multilevel"/>
     <w:tmpl w:val="FE3E87A1"/>
     <w:lvl w:ilvl="0" w:tentative="0">
       <w:start w:val="2"/>
@@ -250,6 +376,126 @@
       <w:suff w:val="space"/>
       <w:lvlText w:val="%1."/>
       <w:lvlJc w:val="left"/>
+    </w:lvl>
+    <w:lvl w:ilvl="1" w:tentative="0">
+      <w:start w:val="1"/>
+      <w:numFmt w:val="lowerLetter"/>
+      <w:lvlText w:val="%2)"/>
+      <w:lvlJc w:val="left"/>
+      <w:pPr>
+        <w:tabs>
+          <w:tab w:val="left" w:pos="840"/>
+        </w:tabs>
+        <w:ind w:left="840" w:leftChars="0" w:hanging="420" w:firstLineChars="0"/>
+      </w:pPr>
+      <w:rPr>
+        <w:rFonts w:hint="default"/>
+      </w:rPr>
+    </w:lvl>
+    <w:lvl w:ilvl="2" w:tentative="0">
+      <w:start w:val="1"/>
+      <w:numFmt w:val="lowerRoman"/>
+      <w:lvlText w:val="%3."/>
+      <w:lvlJc w:val="left"/>
+      <w:pPr>
+        <w:tabs>
+          <w:tab w:val="left" w:pos="1260"/>
+        </w:tabs>
+        <w:ind w:left="1260" w:leftChars="0" w:hanging="420" w:firstLineChars="0"/>
+      </w:pPr>
+      <w:rPr>
+        <w:rFonts w:hint="default"/>
+      </w:rPr>
+    </w:lvl>
+    <w:lvl w:ilvl="3" w:tentative="0">
+      <w:start w:val="1"/>
+      <w:numFmt w:val="decimal"/>
+      <w:lvlText w:val="%4."/>
+      <w:lvlJc w:val="left"/>
+      <w:pPr>
+        <w:tabs>
+          <w:tab w:val="left" w:pos="1680"/>
+        </w:tabs>
+        <w:ind w:left="1680" w:leftChars="0" w:hanging="420" w:firstLineChars="0"/>
+      </w:pPr>
+      <w:rPr>
+        <w:rFonts w:hint="default"/>
+      </w:rPr>
+    </w:lvl>
+    <w:lvl w:ilvl="4" w:tentative="0">
+      <w:start w:val="1"/>
+      <w:numFmt w:val="lowerLetter"/>
+      <w:lvlText w:val="%5)"/>
+      <w:lvlJc w:val="left"/>
+      <w:pPr>
+        <w:tabs>
+          <w:tab w:val="left" w:pos="2100"/>
+        </w:tabs>
+        <w:ind w:left="2100" w:leftChars="0" w:hanging="420" w:firstLineChars="0"/>
+      </w:pPr>
+      <w:rPr>
+        <w:rFonts w:hint="default"/>
+      </w:rPr>
+    </w:lvl>
+    <w:lvl w:ilvl="5" w:tentative="0">
+      <w:start w:val="1"/>
+      <w:numFmt w:val="lowerRoman"/>
+      <w:lvlText w:val="%6."/>
+      <w:lvlJc w:val="left"/>
+      <w:pPr>
+        <w:tabs>
+          <w:tab w:val="left" w:pos="2520"/>
+        </w:tabs>
+        <w:ind w:left="2520" w:leftChars="0" w:hanging="420" w:firstLineChars="0"/>
+      </w:pPr>
+      <w:rPr>
+        <w:rFonts w:hint="default"/>
+      </w:rPr>
+    </w:lvl>
+    <w:lvl w:ilvl="6" w:tentative="0">
+      <w:start w:val="1"/>
+      <w:numFmt w:val="decimal"/>
+      <w:lvlText w:val="%7."/>
+      <w:lvlJc w:val="left"/>
+      <w:pPr>
+        <w:tabs>
+          <w:tab w:val="left" w:pos="2940"/>
+        </w:tabs>
+        <w:ind w:left="2940" w:leftChars="0" w:hanging="420" w:firstLineChars="0"/>
+      </w:pPr>
+      <w:rPr>
+        <w:rFonts w:hint="default"/>
+      </w:rPr>
+    </w:lvl>
+    <w:lvl w:ilvl="7" w:tentative="0">
+      <w:start w:val="1"/>
+      <w:numFmt w:val="lowerLetter"/>
+      <w:lvlText w:val="%8)"/>
+      <w:lvlJc w:val="left"/>
+      <w:pPr>
+        <w:tabs>
+          <w:tab w:val="left" w:pos="3360"/>
+        </w:tabs>
+        <w:ind w:left="3360" w:leftChars="0" w:hanging="420" w:firstLineChars="0"/>
+      </w:pPr>
+      <w:rPr>
+        <w:rFonts w:hint="default"/>
+      </w:rPr>
+    </w:lvl>
+    <w:lvl w:ilvl="8" w:tentative="0">
+      <w:start w:val="1"/>
+      <w:numFmt w:val="lowerRoman"/>
+      <w:lvlText w:val="%9."/>
+      <w:lvlJc w:val="left"/>
+      <w:pPr>
+        <w:tabs>
+          <w:tab w:val="left" w:pos="3780"/>
+        </w:tabs>
+        <w:ind w:left="3780" w:leftChars="0" w:hanging="420" w:firstLineChars="0"/>
+      </w:pPr>
+      <w:rPr>
+        <w:rFonts w:hint="default"/>
+      </w:rPr>
     </w:lvl>
   </w:abstractNum>
   <w:num w:numId="1">
@@ -263,7 +509,7 @@
   <w:docDefaults>
     <w:rPrDefault>
       <w:rPr>
-        <w:rFonts w:asciiTheme="minorHAnsi" w:hAnsiTheme="minorHAnsi" w:eastAsiaTheme="minorEastAsia" w:cstheme="minorBidi"/>
+        <w:rFonts w:ascii="Times New Roman" w:hAnsi="Times New Roman" w:eastAsia="SimSun" w:cs="Times New Roman"/>
       </w:rPr>
     </w:rPrDefault>
     <w:pPrDefault/>
@@ -545,6 +791,27 @@
       </w:tblCellMar>
     </w:tblPr>
   </w:style>
+  <w:style w:type="paragraph" w:customStyle="1" w:styleId="4">
+    <w:name w:val="p1"/>
+    <w:uiPriority w:val="0"/>
+    <w:pPr>
+      <w:spacing w:before="0" w:beforeAutospacing="0" w:after="0" w:afterAutospacing="0"/>
+      <w:ind w:left="0" w:right="0"/>
+      <w:jc w:val="left"/>
+    </w:pPr>
+    <w:rPr>
+      <w:rFonts w:ascii="menlo" w:hAnsi="menlo" w:eastAsia="menlo" w:cs="menlo"/>
+      <w:color w:val="000000"/>
+      <w:kern w:val="0"/>
+      <w:sz w:val="22"/>
+      <w:szCs w:val="22"/>
+      <w:lang w:val="en-US" w:eastAsia="zh-CN" w:bidi="ar"/>
+    </w:rPr>
+  </w:style>
+  <w:style w:type="character" w:customStyle="1" w:styleId="5">
+    <w:name w:val="s1"/>
+    <w:uiPriority w:val="0"/>
+  </w:style>
 </w:styles>
 </file>
 

</xml_diff>